<commit_message>
chery-pick new commit on branch HNghia, move file expected.txt, ssb_system.png on to second_week folder, add file .env.development.json on /backend/ for string connection
</commit_message>
<xml_diff>
--- a/others/docs/SecondWeek/Task_Second_Week.docx
+++ b/others/docs/SecondWeek/Task_Second_Week.docx
@@ -46,10 +46,10 @@
       </w:tblPr>
       <w:tblGrid>
         <w:gridCol w:w="1391"/>
-        <w:gridCol w:w="2342"/>
-        <w:gridCol w:w="2161"/>
-        <w:gridCol w:w="1613"/>
-        <w:gridCol w:w="2465"/>
+        <w:gridCol w:w="2341"/>
+        <w:gridCol w:w="2162"/>
+        <w:gridCol w:w="1612"/>
+        <w:gridCol w:w="2466"/>
       </w:tblGrid>
       <w:tr>
         <w:trPr/>
@@ -86,7 +86,7 @@
         </w:tc>
         <w:tc>
           <w:tcPr>
-            <w:tcW w:w="2342" w:type="dxa"/>
+            <w:tcW w:w="2341" w:type="dxa"/>
             <w:tcBorders>
               <w:top w:val="single" w:sz="4" w:space="0" w:color="000000"/>
               <w:start w:val="single" w:sz="4" w:space="0" w:color="000000"/>
@@ -111,13 +111,13 @@
                 <w:sz w:val="20"/>
                 <w:szCs w:val="20"/>
               </w:rPr>
-              <w:t>ThoạiTask</w:t>
-            </w:r>
-          </w:p>
-        </w:tc>
-        <w:tc>
-          <w:tcPr>
-            <w:tcW w:w="2161" w:type="dxa"/>
+              <w:t>Task</w:t>
+            </w:r>
+          </w:p>
+        </w:tc>
+        <w:tc>
+          <w:tcPr>
+            <w:tcW w:w="2162" w:type="dxa"/>
             <w:tcBorders>
               <w:top w:val="single" w:sz="4" w:space="0" w:color="000000"/>
               <w:start w:val="single" w:sz="4" w:space="0" w:color="000000"/>
@@ -148,7 +148,7 @@
         </w:tc>
         <w:tc>
           <w:tcPr>
-            <w:tcW w:w="1613" w:type="dxa"/>
+            <w:tcW w:w="1612" w:type="dxa"/>
             <w:tcBorders>
               <w:top w:val="single" w:sz="4" w:space="0" w:color="000000"/>
               <w:start w:val="single" w:sz="4" w:space="0" w:color="000000"/>
@@ -179,7 +179,7 @@
         </w:tc>
         <w:tc>
           <w:tcPr>
-            <w:tcW w:w="2465" w:type="dxa"/>
+            <w:tcW w:w="2466" w:type="dxa"/>
             <w:tcBorders>
               <w:top w:val="single" w:sz="4" w:space="0" w:color="000000"/>
               <w:start w:val="single" w:sz="4" w:space="0" w:color="000000"/>
@@ -245,7 +245,7 @@
         </w:tc>
         <w:tc>
           <w:tcPr>
-            <w:tcW w:w="2342" w:type="dxa"/>
+            <w:tcW w:w="2341" w:type="dxa"/>
             <w:tcBorders>
               <w:start w:val="single" w:sz="4" w:space="0" w:color="000000"/>
               <w:bottom w:val="single" w:sz="4" w:space="0" w:color="000000"/>
@@ -274,7 +274,7 @@
         </w:tc>
         <w:tc>
           <w:tcPr>
-            <w:tcW w:w="2161" w:type="dxa"/>
+            <w:tcW w:w="2162" w:type="dxa"/>
             <w:tcBorders>
               <w:start w:val="single" w:sz="4" w:space="0" w:color="000000"/>
               <w:bottom w:val="single" w:sz="4" w:space="0" w:color="000000"/>
@@ -303,7 +303,7 @@
         </w:tc>
         <w:tc>
           <w:tcPr>
-            <w:tcW w:w="1613" w:type="dxa"/>
+            <w:tcW w:w="1612" w:type="dxa"/>
             <w:tcBorders>
               <w:start w:val="single" w:sz="4" w:space="0" w:color="000000"/>
               <w:bottom w:val="single" w:sz="4" w:space="0" w:color="000000"/>
@@ -332,7 +332,7 @@
         </w:tc>
         <w:tc>
           <w:tcPr>
-            <w:tcW w:w="2465" w:type="dxa"/>
+            <w:tcW w:w="2466" w:type="dxa"/>
             <w:tcBorders>
               <w:start w:val="single" w:sz="4" w:space="0" w:color="000000"/>
               <w:bottom w:val="single" w:sz="4" w:space="0" w:color="000000"/>
@@ -396,7 +396,7 @@
         </w:tc>
         <w:tc>
           <w:tcPr>
-            <w:tcW w:w="2342" w:type="dxa"/>
+            <w:tcW w:w="2341" w:type="dxa"/>
             <w:tcBorders>
               <w:start w:val="single" w:sz="4" w:space="0" w:color="000000"/>
               <w:bottom w:val="single" w:sz="4" w:space="0" w:color="000000"/>
@@ -425,7 +425,7 @@
         </w:tc>
         <w:tc>
           <w:tcPr>
-            <w:tcW w:w="2161" w:type="dxa"/>
+            <w:tcW w:w="2162" w:type="dxa"/>
             <w:tcBorders>
               <w:start w:val="single" w:sz="4" w:space="0" w:color="000000"/>
               <w:bottom w:val="single" w:sz="4" w:space="0" w:color="000000"/>
@@ -454,7 +454,7 @@
         </w:tc>
         <w:tc>
           <w:tcPr>
-            <w:tcW w:w="1613" w:type="dxa"/>
+            <w:tcW w:w="1612" w:type="dxa"/>
             <w:tcBorders>
               <w:start w:val="single" w:sz="4" w:space="0" w:color="000000"/>
               <w:bottom w:val="single" w:sz="4" w:space="0" w:color="000000"/>
@@ -483,7 +483,7 @@
         </w:tc>
         <w:tc>
           <w:tcPr>
-            <w:tcW w:w="2465" w:type="dxa"/>
+            <w:tcW w:w="2466" w:type="dxa"/>
             <w:tcBorders>
               <w:start w:val="single" w:sz="4" w:space="0" w:color="000000"/>
               <w:bottom w:val="single" w:sz="4" w:space="0" w:color="000000"/>
@@ -547,7 +547,7 @@
         </w:tc>
         <w:tc>
           <w:tcPr>
-            <w:tcW w:w="2342" w:type="dxa"/>
+            <w:tcW w:w="2341" w:type="dxa"/>
             <w:tcBorders>
               <w:start w:val="single" w:sz="4" w:space="0" w:color="000000"/>
               <w:bottom w:val="single" w:sz="4" w:space="0" w:color="000000"/>
@@ -576,7 +576,7 @@
         </w:tc>
         <w:tc>
           <w:tcPr>
-            <w:tcW w:w="2161" w:type="dxa"/>
+            <w:tcW w:w="2162" w:type="dxa"/>
             <w:tcBorders>
               <w:start w:val="single" w:sz="4" w:space="0" w:color="000000"/>
               <w:bottom w:val="single" w:sz="4" w:space="0" w:color="000000"/>
@@ -605,7 +605,7 @@
         </w:tc>
         <w:tc>
           <w:tcPr>
-            <w:tcW w:w="1613" w:type="dxa"/>
+            <w:tcW w:w="1612" w:type="dxa"/>
             <w:tcBorders>
               <w:start w:val="single" w:sz="4" w:space="0" w:color="000000"/>
               <w:bottom w:val="single" w:sz="4" w:space="0" w:color="000000"/>
@@ -634,7 +634,7 @@
         </w:tc>
         <w:tc>
           <w:tcPr>
-            <w:tcW w:w="2465" w:type="dxa"/>
+            <w:tcW w:w="2466" w:type="dxa"/>
             <w:tcBorders>
               <w:start w:val="single" w:sz="4" w:space="0" w:color="000000"/>
               <w:bottom w:val="single" w:sz="4" w:space="0" w:color="000000"/>
@@ -698,7 +698,7 @@
         </w:tc>
         <w:tc>
           <w:tcPr>
-            <w:tcW w:w="2342" w:type="dxa"/>
+            <w:tcW w:w="2341" w:type="dxa"/>
             <w:tcBorders>
               <w:start w:val="single" w:sz="4" w:space="0" w:color="000000"/>
               <w:bottom w:val="single" w:sz="4" w:space="0" w:color="000000"/>
@@ -727,7 +727,7 @@
         </w:tc>
         <w:tc>
           <w:tcPr>
-            <w:tcW w:w="2161" w:type="dxa"/>
+            <w:tcW w:w="2162" w:type="dxa"/>
             <w:tcBorders>
               <w:start w:val="single" w:sz="4" w:space="0" w:color="000000"/>
               <w:bottom w:val="single" w:sz="4" w:space="0" w:color="000000"/>
@@ -756,7 +756,7 @@
         </w:tc>
         <w:tc>
           <w:tcPr>
-            <w:tcW w:w="1613" w:type="dxa"/>
+            <w:tcW w:w="1612" w:type="dxa"/>
             <w:tcBorders>
               <w:start w:val="single" w:sz="4" w:space="0" w:color="000000"/>
               <w:bottom w:val="single" w:sz="4" w:space="0" w:color="000000"/>
@@ -804,7 +804,7 @@
         </w:tc>
         <w:tc>
           <w:tcPr>
-            <w:tcW w:w="2465" w:type="dxa"/>
+            <w:tcW w:w="2466" w:type="dxa"/>
             <w:tcBorders>
               <w:start w:val="single" w:sz="4" w:space="0" w:color="000000"/>
               <w:bottom w:val="single" w:sz="4" w:space="0" w:color="000000"/>
@@ -868,7 +868,7 @@
         </w:tc>
         <w:tc>
           <w:tcPr>
-            <w:tcW w:w="2342" w:type="dxa"/>
+            <w:tcW w:w="2341" w:type="dxa"/>
             <w:tcBorders>
               <w:start w:val="single" w:sz="4" w:space="0" w:color="000000"/>
               <w:bottom w:val="single" w:sz="4" w:space="0" w:color="000000"/>
@@ -897,7 +897,7 @@
         </w:tc>
         <w:tc>
           <w:tcPr>
-            <w:tcW w:w="2161" w:type="dxa"/>
+            <w:tcW w:w="2162" w:type="dxa"/>
             <w:tcBorders>
               <w:start w:val="single" w:sz="4" w:space="0" w:color="000000"/>
               <w:bottom w:val="single" w:sz="4" w:space="0" w:color="000000"/>
@@ -926,7 +926,7 @@
         </w:tc>
         <w:tc>
           <w:tcPr>
-            <w:tcW w:w="1613" w:type="dxa"/>
+            <w:tcW w:w="1612" w:type="dxa"/>
             <w:tcBorders>
               <w:start w:val="single" w:sz="4" w:space="0" w:color="000000"/>
               <w:bottom w:val="single" w:sz="4" w:space="0" w:color="000000"/>
@@ -955,7 +955,7 @@
         </w:tc>
         <w:tc>
           <w:tcPr>
-            <w:tcW w:w="2465" w:type="dxa"/>
+            <w:tcW w:w="2466" w:type="dxa"/>
             <w:tcBorders>
               <w:start w:val="single" w:sz="4" w:space="0" w:color="000000"/>
               <w:bottom w:val="single" w:sz="4" w:space="0" w:color="000000"/>
@@ -1019,7 +1019,7 @@
         </w:tc>
         <w:tc>
           <w:tcPr>
-            <w:tcW w:w="2342" w:type="dxa"/>
+            <w:tcW w:w="2341" w:type="dxa"/>
             <w:tcBorders>
               <w:start w:val="single" w:sz="4" w:space="0" w:color="000000"/>
               <w:bottom w:val="single" w:sz="4" w:space="0" w:color="000000"/>
@@ -1048,7 +1048,7 @@
         </w:tc>
         <w:tc>
           <w:tcPr>
-            <w:tcW w:w="2161" w:type="dxa"/>
+            <w:tcW w:w="2162" w:type="dxa"/>
             <w:tcBorders>
               <w:start w:val="single" w:sz="4" w:space="0" w:color="000000"/>
               <w:bottom w:val="single" w:sz="4" w:space="0" w:color="000000"/>
@@ -1077,7 +1077,7 @@
         </w:tc>
         <w:tc>
           <w:tcPr>
-            <w:tcW w:w="1613" w:type="dxa"/>
+            <w:tcW w:w="1612" w:type="dxa"/>
             <w:tcBorders>
               <w:start w:val="single" w:sz="4" w:space="0" w:color="000000"/>
               <w:bottom w:val="single" w:sz="4" w:space="0" w:color="000000"/>
@@ -1106,7 +1106,7 @@
         </w:tc>
         <w:tc>
           <w:tcPr>
-            <w:tcW w:w="2465" w:type="dxa"/>
+            <w:tcW w:w="2466" w:type="dxa"/>
             <w:tcBorders>
               <w:start w:val="single" w:sz="4" w:space="0" w:color="000000"/>
               <w:bottom w:val="single" w:sz="4" w:space="0" w:color="000000"/>
@@ -1170,7 +1170,7 @@
         </w:tc>
         <w:tc>
           <w:tcPr>
-            <w:tcW w:w="2342" w:type="dxa"/>
+            <w:tcW w:w="2341" w:type="dxa"/>
             <w:tcBorders>
               <w:start w:val="single" w:sz="4" w:space="0" w:color="000000"/>
               <w:bottom w:val="single" w:sz="4" w:space="0" w:color="000000"/>
@@ -1199,7 +1199,7 @@
         </w:tc>
         <w:tc>
           <w:tcPr>
-            <w:tcW w:w="2161" w:type="dxa"/>
+            <w:tcW w:w="2162" w:type="dxa"/>
             <w:tcBorders>
               <w:start w:val="single" w:sz="4" w:space="0" w:color="000000"/>
               <w:bottom w:val="single" w:sz="4" w:space="0" w:color="000000"/>
@@ -1228,7 +1228,7 @@
         </w:tc>
         <w:tc>
           <w:tcPr>
-            <w:tcW w:w="1613" w:type="dxa"/>
+            <w:tcW w:w="1612" w:type="dxa"/>
             <w:tcBorders>
               <w:start w:val="single" w:sz="4" w:space="0" w:color="000000"/>
               <w:bottom w:val="single" w:sz="4" w:space="0" w:color="000000"/>
@@ -1257,7 +1257,7 @@
         </w:tc>
         <w:tc>
           <w:tcPr>
-            <w:tcW w:w="2465" w:type="dxa"/>
+            <w:tcW w:w="2466" w:type="dxa"/>
             <w:tcBorders>
               <w:start w:val="single" w:sz="4" w:space="0" w:color="000000"/>
               <w:bottom w:val="single" w:sz="4" w:space="0" w:color="000000"/>

</xml_diff>